<commit_message>
Link and refresh complete ZIP with updated PCC template
</commit_message>
<xml_diff>
--- a/docs/Digital_Cognitive_Firewall_PCC26_Concept_Note.docx
+++ b/docs/Digital_Cognitive_Firewall_PCC26_Concept_Note.docx
@@ -2827,6 +2827,20 @@
               </w:rPr>
               <w:t xml:space="preserve">.</w:t>
             </w:r>
+            <w:r>
+              <w:br/>
+            </w:r>
+            <w:hyperlink r:id="rIdCompleteProjectZIP">
+              <w:r>
+                <w:rPr>
+                  <w:rFonts w:ascii="Calibri" w:hAnsi="Calibri"/>
+                  <w:sz w:val="18"/>
+                  <w:color w:val="0563C1"/>
+                  <w:u w:val="single"/>
+                </w:rPr>
+                <w:t>Download complete project ZIP</w:t>
+              </w:r>
+            </w:hyperlink>
           </w:p>
         </w:tc>
       </w:tr>

</xml_diff>